<commit_message>
feat(cuentas): formulario de alta según permisos (comercial ve 4 campos, admin completo)
- Todos los puntos de creación de Cuenta (módulo Cuentas + Leads/Contactos/Visitas y fichas) reutilizan el mismo componente openClientDrawer, que ya oculta los campos admin-only a los usuarios comerciales
- Comercial ve solo: Nombre comercial, Cliente Colliers, Unidades de Negocio y Tipo de Cuenta
- Se oculta también 'Creado por' a comerciales; admin mantiene el formulario completo
- Los selectores de Cuenta (crear al vuelo) ahora abren openClientDrawer en vez del modal simplificado, unificando el componente y respetando permisos
- z-index del drawer de Cuenta elevado para abrirse sobre otros drawers, con backdrop propio
- Guía de Cuentas actualizada a v1.1
</commit_message>
<xml_diff>
--- a/docs/manuales/Guia_Cuentas.docx
+++ b/docs/manuales/Guia_Cuentas.docx
@@ -80,7 +80,7 @@
           <w:color w:val="56648F"/>
           <w:sz w:val="21"/>
         </w:rPr>
-        <w:t>Versión 1.0   ·   23/07/2026</w:t>
+        <w:t>Versión 1.1   ·   23/07/2026</w:t>
       </w:r>
     </w:p>
     <w:p/>
@@ -96,7 +96,7 @@
     </w:p>
     <w:p>
       <w:r>
-        <w:t>Permite dar de alta y mantener las cuentas (empresas) con las que trabaja Colliers. Es la base del CRM: sobre las cuentas se cargan contactos, visitas y actividad comercial.</w:t>
+        <w:t>Permite dar de alta y mantener las cuentas (empresas) con las que trabaja Colliers. Es la base del CRM: sobre las cuentas se cargan contactos, visitas y actividad comercial. Los usuarios comerciales ven un formulario reducido (Nombre comercial, Cliente Colliers, Unidades de negocio y Tipo de cuenta) para un alta rápida; los administradores ven el formulario completo. Es el mismo formulario que aparece al crear una cuenta desde otros módulos.</w:t>
       </w:r>
     </w:p>
     <w:p/>

</xml_diff>